<commit_message>
docs: Clients R6 — reframe nav finding as wrong-color + 4px baseline shift
Re-tested with the dev's actual current portal state. Active state
DOES apply on non-Home routes — but with the wrong styling:

  • Color: bright blue text + light-blue tinted background (should
    be near-white text on a neutral dark-grey pill)
  • Padding: 4px 8px instead of 6px 12px — that 2px-less vertical
    padding is what makes the active text baseline sit 4px higher
    than the other nav links
  • Home route is a separate edge case: active state doesn't fire
    at all there

Reframed the finding to call out the color + design + behaviour
match against the original, plus the specific 4px baseline shift
that's the visible symptom Nikko flagged.

Co-Authored-By: Claude Opus 4.7 <noreply@anthropic.com>
</commit_message>
<xml_diff>
--- a/docs/qa-comparison/client-page-qa-round6.docx
+++ b/docs/qa-comparison/client-page-qa-round6.docx
@@ -59,7 +59,7 @@
         <w:rPr>
           <w:sz w:val="22"/>
         </w:rPr>
-        <w:t>Round 6 verification of the Clients page. Surfaced after Nikko flagged the JETT Australia Notes "+ New note" button design + the missing kebab → Edit client details flow, then expanded across the Team panel (× buttons unwired, Add team member dropdown in light mode), the Add Contact modal deviation, and the top-nav active-state animation gap. Walked the same surfaces as R5 to see which findings shipped vs which are still open.</w:t>
+        <w:t>Round 6 verification of the Clients page. Surfaced after Nikko flagged the JETT Australia Notes "+ New note" button design + the missing kebab → Edit client details flow, then expanded across the Team panel (× buttons unwired, Add team member dropdown in light mode), the Add Contact modal deviation, and the top-nav active-state styling (wrong color + 4px baseline shift that makes the active page's text sit higher than the rest of the nav row). Walked the same surfaces as R5 to see which findings shipped vs which are still open.</w:t>
         <w:br/>
         <w:br/>
       </w:r>
@@ -137,7 +137,7 @@
           <w:color w:val="0F1A2A"/>
           <w:sz w:val="24"/>
         </w:rPr>
-        <w:t>Top-nav active state never applies — every nav link renders identically regardless of which page is open</w:t>
+        <w:t>Top-nav active state uses the wrong color + smaller padding, so the active page's text sits ~4px higher than the rest of the nav row</w:t>
       </w:r>
     </w:p>
     <w:p>
@@ -154,7 +154,7 @@
           <w:color w:val="0F1A2A"/>
           <w:sz w:val="21"/>
         </w:rPr>
-        <w:t>Top → click any nav link (Home / Clients / Ops / Analytics / Weekly WIP / Templates). Watch the nav bar as the route changes. Compare against the same click on the original build.</w:t>
+        <w:t>Top nav, on any non-Home route (Clients / Ops / Analytics / Weekly WIP / Templates). Look at where the active link's text baseline sits compared to the other links. Compare against the original build on the same route.</w:t>
       </w:r>
     </w:p>
     <w:p>
@@ -171,7 +171,7 @@
           <w:color w:val="0F1A2A"/>
           <w:sz w:val="21"/>
         </w:rPr>
-        <w:t>Probed the rendered nav-link styles via DOM inspection on the Home route (/projects-v2/home). Every link renders identically:</w:t>
+        <w:t>Active link on the Clients route, measured via DOM:</w:t>
       </w:r>
       <w:r>
         <w:br/>
@@ -181,7 +181,6 @@
           <w:color w:val="0F1A2A"/>
           <w:sz w:val="21"/>
         </w:rPr>
-        <w:t xml:space="preserve">  • background: rgba(0, 0, 0, 0) (transparent)</w:t>
       </w:r>
       <w:r>
         <w:br/>
@@ -191,7 +190,7 @@
           <w:color w:val="0F1A2A"/>
           <w:sz w:val="21"/>
         </w:rPr>
-        <w:t xml:space="preserve">  • color: rgb(168, 168, 173) (muted grey)</w:t>
+        <w:t xml:space="preserve">  • top: 7.75px (rest of the nav links: 11.75px — active sits 4px higher, which is what you see visually)</w:t>
       </w:r>
       <w:r>
         <w:br/>
@@ -201,7 +200,7 @@
           <w:color w:val="0F1A2A"/>
           <w:sz w:val="21"/>
         </w:rPr>
-        <w:t xml:space="preserve">  • font-weight: 500</w:t>
+        <w:t xml:space="preserve">  • height: 39.5px (rest: 31.5px — active is 8px taller because of the misaligned padding)</w:t>
       </w:r>
       <w:r>
         <w:br/>
@@ -211,7 +210,7 @@
           <w:color w:val="0F1A2A"/>
           <w:sz w:val="21"/>
         </w:rPr>
-        <w:t xml:space="preserve">  • no aria-current attribute</w:t>
+        <w:t xml:space="preserve">  • padding: 4px 8px (rest: 6px 12px)</w:t>
       </w:r>
       <w:r>
         <w:br/>
@@ -221,7 +220,7 @@
           <w:color w:val="0F1A2A"/>
           <w:sz w:val="21"/>
         </w:rPr>
-        <w:t xml:space="preserve">  • no .on class</w:t>
+        <w:t xml:space="preserve">  • color: rgb(14, 165, 233) — bright blue text</w:t>
       </w:r>
       <w:r>
         <w:br/>
@@ -231,6 +230,7 @@
           <w:color w:val="0F1A2A"/>
           <w:sz w:val="21"/>
         </w:rPr>
+        <w:t xml:space="preserve">  • background: light blue tint (srgb 0.054 0.647 0.913 / 0.1)</w:t>
       </w:r>
       <w:r>
         <w:br/>
@@ -240,7 +240,93 @@
           <w:color w:val="0F1A2A"/>
           <w:sz w:val="21"/>
         </w:rPr>
-        <w:t>Same values on every link including Home (the one that should be active). User cannot tell which page they are on by looking at the nav. The transition CSS is wired correctly (color 0.15s, background 0.15s) — the animation infrastructure is fine; the active class just never gets applied so there is nothing to transition TO.</w:t>
+        <w:t xml:space="preserve">  • font-weight: 600</w:t>
+      </w:r>
+      <w:r>
+        <w:br/>
+      </w:r>
+      <w:r>
+        <w:rPr>
+          <w:color w:val="0F1A2A"/>
+          <w:sz w:val="21"/>
+        </w:rPr>
+        <w:t xml:space="preserve">  • aria-current: "page"</w:t>
+      </w:r>
+      <w:r>
+        <w:br/>
+      </w:r>
+      <w:r>
+        <w:rPr>
+          <w:color w:val="0F1A2A"/>
+          <w:sz w:val="21"/>
+        </w:rPr>
+      </w:r>
+      <w:r>
+        <w:br/>
+      </w:r>
+      <w:r>
+        <w:rPr>
+          <w:color w:val="0F1A2A"/>
+          <w:sz w:val="21"/>
+        </w:rPr>
+        <w:t>Two distinct problems stacked:</w:t>
+      </w:r>
+      <w:r>
+        <w:br/>
+      </w:r>
+      <w:r>
+        <w:rPr>
+          <w:color w:val="0F1A2A"/>
+          <w:sz w:val="21"/>
+        </w:rPr>
+      </w:r>
+      <w:r>
+        <w:br/>
+      </w:r>
+      <w:r>
+        <w:rPr>
+          <w:color w:val="0F1A2A"/>
+          <w:sz w:val="21"/>
+        </w:rPr>
+        <w:t xml:space="preserve">  1. Color + design. The active treatment is a bright-blue tinted pill in the brand-blue family. Reads like a CTA or a hover preview, not a quiet "you are here" marker. Pulls attention away from page content because the nav now competes with the primary surface for visual weight.</w:t>
+      </w:r>
+      <w:r>
+        <w:br/>
+      </w:r>
+      <w:r>
+        <w:rPr>
+          <w:color w:val="0F1A2A"/>
+          <w:sz w:val="21"/>
+        </w:rPr>
+      </w:r>
+      <w:r>
+        <w:br/>
+      </w:r>
+      <w:r>
+        <w:rPr>
+          <w:color w:val="0F1A2A"/>
+          <w:sz w:val="21"/>
+        </w:rPr>
+        <w:t xml:space="preserve">  2. Behaviour / alignment. The active link uses smaller vertical padding (4px vs 6px), so the text baseline shifts up by 4px relative to the other links. The active page label visually floats higher than the rest of the nav row, breaking the alignment of the whole nav bar.</w:t>
+      </w:r>
+      <w:r>
+        <w:br/>
+      </w:r>
+      <w:r>
+        <w:rPr>
+          <w:color w:val="0F1A2A"/>
+          <w:sz w:val="21"/>
+        </w:rPr>
+      </w:r>
+      <w:r>
+        <w:br/>
+      </w:r>
+      <w:r>
+        <w:rPr>
+          <w:color w:val="0F1A2A"/>
+          <w:sz w:val="21"/>
+        </w:rPr>
+        <w:t>(Note on the Home route specifically: the active state appears to not fire at all there — every link including Home renders identically with no aria-current. Same component, different behaviour based on route. Both behaviours are wrong relative to the original.)</w:t>
       </w:r>
     </w:p>
     <w:p>
@@ -257,7 +343,7 @@
           <w:color w:val="0F1A2A"/>
           <w:sz w:val="21"/>
         </w:rPr>
-        <w:t>Same DOM probe on the original build (also on Home / #overview). The active link picks up clear styling while others stay muted:</w:t>
+        <w:t>Same DOM probe on the original build. Active link treatment:</w:t>
       </w:r>
       <w:r>
         <w:br/>
@@ -267,7 +353,6 @@
           <w:color w:val="0F1A2A"/>
           <w:sz w:val="21"/>
         </w:rPr>
-        <w:t xml:space="preserve">  • active background: rgb(44, 44, 46) (dark-grey pill)</w:t>
       </w:r>
       <w:r>
         <w:br/>
@@ -277,7 +362,7 @@
           <w:color w:val="0F1A2A"/>
           <w:sz w:val="21"/>
         </w:rPr>
-        <w:t xml:space="preserve">  • active color: rgb(245, 245, 247) (near-white)</w:t>
+        <w:t xml:space="preserve">  • background: rgb(44, 44, 46) (neutral dark-grey pill, not brand-blue)</w:t>
       </w:r>
       <w:r>
         <w:br/>
@@ -287,7 +372,7 @@
           <w:color w:val="0F1A2A"/>
           <w:sz w:val="21"/>
         </w:rPr>
-        <w:t xml:space="preserve">  • active font-weight: 600 (bolder)</w:t>
+        <w:t xml:space="preserve">  • color: rgb(245, 245, 247) (near-white text, not blue)</w:t>
       </w:r>
       <w:r>
         <w:br/>
@@ -297,7 +382,7 @@
           <w:color w:val="0F1A2A"/>
           <w:sz w:val="21"/>
         </w:rPr>
-        <w:t xml:space="preserve">  • aria-current="page"</w:t>
+        <w:t xml:space="preserve">  • padding: SAME as the other links — no vertical shift, so the active text stays on the same baseline as everything else in the nav row</w:t>
       </w:r>
       <w:r>
         <w:br/>
@@ -307,7 +392,7 @@
           <w:color w:val="0F1A2A"/>
           <w:sz w:val="21"/>
         </w:rPr>
-        <w:t xml:space="preserve">  • class="on"</w:t>
+        <w:t xml:space="preserve">  • font-weight: 600 (bolder, so the active label reads as the current page without needing color to scream)</w:t>
       </w:r>
       <w:r>
         <w:br/>
@@ -317,6 +402,7 @@
           <w:color w:val="0F1A2A"/>
           <w:sz w:val="21"/>
         </w:rPr>
+        <w:t xml:space="preserve">  • aria-current: "page"</w:t>
       </w:r>
       <w:r>
         <w:br/>
@@ -326,7 +412,26 @@
           <w:color w:val="0F1A2A"/>
           <w:sz w:val="21"/>
         </w:rPr>
-        <w:t>Inactive links stay at the same transparent / muted treatment the portal uses everywhere. Result: the active link reads as a soft dark pill against the top-nav row; the brightness + weight bump makes it obvious which surface you are on. Same CSS transition string already in place on the portal, so the only thing missing is the class toggle.</w:t>
+        <w:t xml:space="preserve">  • class: "on"</w:t>
+      </w:r>
+      <w:r>
+        <w:br/>
+      </w:r>
+      <w:r>
+        <w:rPr>
+          <w:color w:val="0F1A2A"/>
+          <w:sz w:val="21"/>
+        </w:rPr>
+      </w:r>
+      <w:r>
+        <w:br/>
+      </w:r>
+      <w:r>
+        <w:rPr>
+          <w:color w:val="0F1A2A"/>
+          <w:sz w:val="21"/>
+        </w:rPr>
+        <w:t>The dark-grey pill reads as a quiet "you are here" marker — visible at a glance but doesn't compete with the page below it for attention. Same baseline as the other links so the nav row stays horizontally aligned.</w:t>
       </w:r>
     </w:p>
     <w:p>
@@ -343,7 +448,7 @@
           <w:color w:val="0F1A2A"/>
           <w:sz w:val="21"/>
         </w:rPr>
-        <w:t>Wire the active-state logic. Three pieces:</w:t>
+        <w:t>Match the original's color, design, and behaviour. Three concrete changes on the active-link styling:</w:t>
       </w:r>
       <w:r>
         <w:br/>
@@ -362,7 +467,7 @@
           <w:color w:val="0F1A2A"/>
           <w:sz w:val="21"/>
         </w:rPr>
-        <w:t>1. On every nav link, compute whether the current route matches its href. Use the same URL pathname match the original uses (location.pathname.startsWith(link.href) or an exact match depending on the route shape).</w:t>
+        <w:t>1. Swap the colour palette. Replace:</w:t>
       </w:r>
       <w:r>
         <w:br/>
@@ -372,6 +477,7 @@
           <w:color w:val="0F1A2A"/>
           <w:sz w:val="21"/>
         </w:rPr>
+        <w:t xml:space="preserve">  • background: light blue tint → background: rgb(44, 44, 46) (neutral dark-grey pill)</w:t>
       </w:r>
       <w:r>
         <w:br/>
@@ -381,7 +487,7 @@
           <w:color w:val="0F1A2A"/>
           <w:sz w:val="21"/>
         </w:rPr>
-        <w:t>2. When the match is true, apply on the rendered anchor:</w:t>
+        <w:t xml:space="preserve">  • color: rgb(14, 165, 233) (bright blue) → color: rgb(245, 245, 247) (near-white)</w:t>
       </w:r>
       <w:r>
         <w:br/>
@@ -391,7 +497,7 @@
           <w:color w:val="0F1A2A"/>
           <w:sz w:val="21"/>
         </w:rPr>
-        <w:t xml:space="preserve">  • class: "on" (so the existing CSS hook fires)</w:t>
+        <w:t>Brand blue should not be the marker for current page; it is too loud and competes with the surface below. The dark pill is the right quiet marker.</w:t>
       </w:r>
       <w:r>
         <w:br/>
@@ -401,7 +507,6 @@
           <w:color w:val="0F1A2A"/>
           <w:sz w:val="21"/>
         </w:rPr>
-        <w:t xml:space="preserve">  • aria-current: "page"</w:t>
       </w:r>
       <w:r>
         <w:br/>
@@ -411,7 +516,7 @@
           <w:color w:val="0F1A2A"/>
           <w:sz w:val="21"/>
         </w:rPr>
-        <w:t xml:space="preserve">  • inline style or class that sets background rgb(44, 44, 46), color rgb(245, 245, 247), font-weight 600</w:t>
+        <w:t>2. Keep padding identical to the other nav links. Active link padding: 6px 12px (same as inactive), not 4px 8px. This is what's causing the baseline shift — fix the padding and the active text stops sitting higher than the rest.</w:t>
       </w:r>
       <w:r>
         <w:br/>
@@ -430,7 +535,7 @@
           <w:color w:val="0F1A2A"/>
           <w:sz w:val="21"/>
         </w:rPr>
-        <w:t>3. Confirm the existing transition string stays (color 0.15s, background 0.15s on the anchor). Once the class toggles, the transition kicks in automatically and the pill animates to/from the active state on every nav click.</w:t>
+        <w:t>3. Make Home route consistent. Right now the active state fires on Clients / Ops / etc. but not on Home. Whichever route matches the current URL should apply the active class. Confirm the route-match logic also handles the root path (/projects-v2/ or /projects-v2/home).</w:t>
       </w:r>
       <w:r>
         <w:br/>
@@ -449,7 +554,7 @@
           <w:color w:val="0F1A2A"/>
           <w:sz w:val="21"/>
         </w:rPr>
-        <w:t>Optional polish: add a hover state on inactive links (a 50%-opacity pill) so the user gets click-feedback before they navigate. Source build already has this; verify it lands when the active class wires up.</w:t>
+        <w:t>Keep what's already correct on the portal: font-weight 600, aria-current="page", the transition CSS (color 0.15s, background 0.15s). Those parts match the original; the swap is color + design + padding.</w:t>
       </w:r>
     </w:p>
     <w:p>

</xml_diff>